<commit_message>
Add captioned FieldOps AI demo video
</commit_message>
<xml_diff>
--- a/docs/FIELDOPS_AI_PRD.docx
+++ b/docs/FIELDOPS_AI_PRD.docx
@@ -3476,7 +3476,7 @@
           <w:color w:val="8A4E25"/>
           <w:sz w:val="20"/>
         </w:rPr>
-        <w:t>Example test case: 5 acres of wheat, 17% entered moisture, 0 mm forecast rain produces approximately 32 m3 in this demo formula. With 40 mm forecast rain the net estimate is zero and the app asks for a field recheck. These outputs are for software demonstration, not instructions to irrigate.</w:t>
+        <w:t>Example test case: 5 acres of wheat (2.02343 ha), 17% entered moisture, and 0 mm forecast rain produces approximately 546.3 m3 in this demo formula (the UI rounds to 546 m3). With 40 mm forecast rain the net estimate is zero and the app asks for a field recheck. These outputs are for software demonstration, not instructions to irrigate.</w:t>
       </w:r>
     </w:p>
     <w:p>
@@ -4460,7 +4460,7 @@
                 <w:color w:val="24332D"/>
                 <w:sz w:val="15"/>
               </w:rPr>
-              <w:t>GitHub Actions tests Python 3.11 and 3.13; local environment has 14 passing tests, clean dependency check, and healthy Streamlit endpoint.</w:t>
+              <w:t>GitHub Actions tests Python 3.11 and 3.13; local environment has 15 passing tests, clean dependency check, and healthy Streamlit endpoint.</w:t>
             </w:r>
           </w:p>
         </w:tc>

</xml_diff>